<commit_message>
Add KMS/HSM reference-implementation gap to pitch
</commit_message>
<xml_diff>
--- a/QuorumVault_Executive_Pitch.docx
+++ b/QuorumVault_Executive_Pitch.docx
@@ -194,6 +194,18 @@
           <w:szCs w:val="19"/>
         </w:rPr>
         <w:t xml:space="preserve">It plugs directly into the XRPL Agent Wallet Skill's ExternalSigner contract. This isn't a parallel framework asking your ecosystem to adopt something new — it's the piece your own skill spec says is missing, built to your own spec.</w:t>
+      </w:r>
+    </w:p>
+    <w:p>
+      <w:pPr>
+        <w:spacing w:after="90" w:line="250"/>
+      </w:pPr>
+      <w:r>
+        <w:rPr>
+          <w:sz w:val="19"/>
+          <w:szCs w:val="19"/>
+        </w:rPr>
+        <w:t xml:space="preserve">Your own agent docs name a second gap the same way: step one for any agent wallet is “generate a key pair and store it securely in a KMS or HSM” — no reference implementation, no guidance on how. QuorumVault's SignerBackend abstraction is that answer too: an encrypted local keystore and AWS KMS as interchangeable backends, producing multisigned transactions byte-for-byte identical to XRPL's own native output — the same backend every real transaction below was signed through.</w:t>
       </w:r>
     </w:p>
     <w:p>

</xml_diff>